<commit_message>
fix(docx): mostrar contabilidad y planilla separadas en plantilla Empresarial CTP
</commit_message>
<xml_diff>
--- a/public/plantillas/Plantilla_Plan_EmpresarialCTP_EIRL.docx
+++ b/public/plantillas/Plantilla_Plan_EmpresarialCTP_EIRL.docx
@@ -2576,7 +2576,7 @@
                 <w:rFonts w:ascii="Calibri" w:eastAsia="Calibri" w:hAnsi="Calibri" w:cs="Calibri"/>
                 <w:i/>
               </w:rPr>
-              <w:t>Plan Empresarial CTP</w:t>
+              <w:t>Plan Empresarial CTP (Contabilidad Tributación)</w:t>
             </w:r>
           </w:p>
         </w:tc>
@@ -2634,6 +2634,119 @@
               <w:t>S/0,000.00</w:t>
             </w:r>
             <w:bookmarkEnd w:id="107"/>
+          </w:p>
+        </w:tc>
+      </w:tr>
+      <w:tr>
+        <w:trPr>
+          <w:trHeight w:val="92"/>
+        </w:trPr>
+        <w:tc>
+          <w:tcPr>
+            <w:tcW w:w="772" w:type="dxa"/>
+            <w:tcBorders>
+              <w:bottom w:val="single" w:sz="4" w:space="0" w:color="000000"/>
+            </w:tcBorders>
+            <w:vAlign w:val="center"/>
+          </w:tcPr>
+          <w:p>
+            <w:pPr>
+              <w:spacing w:line="360" w:lineRule="auto"/>
+              <w:jc w:val="center"/>
+              <w:rPr>
+                <w:rFonts w:ascii="Calibri" w:eastAsia="Calibri" w:hAnsi="Calibri" w:cs="Calibri"/>
+                <w:i/>
+              </w:rPr>
+            </w:pPr>
+            <w:r>
+              <w:rPr>
+                <w:rFonts w:ascii="Calibri" w:eastAsia="Calibri" w:hAnsi="Calibri" w:cs="Calibri"/>
+                <w:i/>
+              </w:rPr>
+              <w:t>1</w:t>
+            </w:r>
+          </w:p>
+        </w:tc>
+        <w:tc>
+          <w:tcPr>
+            <w:tcW w:w="4934" w:type="dxa"/>
+            <w:tcBorders>
+              <w:bottom w:val="single" w:sz="4" w:space="0" w:color="000000"/>
+            </w:tcBorders>
+            <w:vAlign w:val="center"/>
+          </w:tcPr>
+          <w:p>
+            <w:pPr>
+              <w:spacing w:line="360" w:lineRule="auto"/>
+              <w:jc w:val="center"/>
+              <w:rPr>
+                <w:rFonts w:ascii="Calibri" w:eastAsia="Calibri" w:hAnsi="Calibri" w:cs="Calibri"/>
+                <w:i/>
+              </w:rPr>
+            </w:pPr>
+            <w:r>
+              <w:rPr>
+                <w:rFonts w:ascii="Calibri" w:eastAsia="Calibri" w:hAnsi="Calibri" w:cs="Calibri"/>
+                <w:i/>
+              </w:rPr>
+              <w:t>Plan Empresarial CTP (Planilla)</w:t>
+            </w:r>
+          </w:p>
+        </w:tc>
+        <w:tc>
+          <w:tcPr>
+            <w:tcW w:w="1550" w:type="dxa"/>
+            <w:tcBorders>
+              <w:bottom w:val="single" w:sz="4" w:space="0" w:color="000000"/>
+            </w:tcBorders>
+            <w:vAlign w:val="center"/>
+          </w:tcPr>
+          <w:p>
+            <w:pPr>
+              <w:spacing w:line="360" w:lineRule="auto"/>
+              <w:jc w:val="center"/>
+              <w:rPr>
+                <w:rFonts w:ascii="Calibri" w:eastAsia="Calibri" w:hAnsi="Calibri" w:cs="Calibri"/>
+                <w:i/>
+              </w:rPr>
+            </w:pPr>
+            <w:bookmarkStart w:id="110" w:name="UnitPlanilla"/>
+            <w:r>
+              <w:rPr>
+                <w:rFonts w:ascii="Calibri" w:eastAsia="Calibri" w:hAnsi="Calibri" w:cs="Calibri"/>
+                <w:i/>
+              </w:rPr>
+              <w:t>S/0,000.00</w:t>
+            </w:r>
+            <w:bookmarkEnd w:id="110"/>
+          </w:p>
+        </w:tc>
+        <w:tc>
+          <w:tcPr>
+            <w:tcW w:w="1594" w:type="dxa"/>
+            <w:tcBorders>
+              <w:bottom w:val="single" w:sz="4" w:space="0" w:color="000000"/>
+            </w:tcBorders>
+            <w:vAlign w:val="center"/>
+          </w:tcPr>
+          <w:p>
+            <w:pPr>
+              <w:spacing w:line="360" w:lineRule="auto"/>
+              <w:jc w:val="right"/>
+              <w:rPr>
+                <w:rFonts w:ascii="Calibri" w:eastAsia="Calibri" w:hAnsi="Calibri" w:cs="Calibri"/>
+                <w:i/>
+              </w:rPr>
+            </w:pPr>
+            <w:bookmarkStart w:id="111" w:name="SubTotalPlanilla"/>
+            <w:r>
+              <w:rPr>
+                <w:rFonts w:ascii="Calibri" w:eastAsia="Calibri" w:hAnsi="Calibri" w:cs="Calibri"/>
+                <w:i/>
+              </w:rPr>
+              <w:t>S/0,000.00</w:t>
+            </w:r>
+            <w:bookmarkEnd w:id="111"/>
           </w:p>
         </w:tc>
       </w:tr>

</xml_diff>